<commit_message>
docs: clarify EDUcheck route prefixes
</commit_message>
<xml_diff>
--- a/EDUcheck_Interview_Guide.docx
+++ b/EDUcheck_Interview_Guide.docx
@@ -2418,6 +2418,60 @@
                 <w:szCs w:val="17"/>
               </w:rPr>
               <w:t xml:space="preserve">Chat pages, messages, unread count, Socket.IO handlers</w:t>
+            </w:r>
+          </w:p>
+        </w:tc>
+      </w:tr>
+    </w:tbl>
+    <w:tbl>
+      <w:tblPr>
+        <w:tblW w:type="pct" w:w="100%"/>
+        <w:tblBorders>
+          <w:top w:val="none" w:color="E7F5F0" w:sz="0"/>
+          <w:left w:val="none" w:color="E7F5F0" w:sz="0"/>
+          <w:bottom w:val="none" w:color="E7F5F0" w:sz="0"/>
+          <w:right w:val="none" w:color="E7F5F0" w:sz="0"/>
+          <w:insideH w:val="none" w:color="E7F5F0" w:sz="0"/>
+          <w:insideV w:val="none" w:color="E7F5F0" w:sz="0"/>
+        </w:tblBorders>
+      </w:tblPr>
+      <w:tblGrid>
+        <w:gridCol w:w="100"/>
+      </w:tblGrid>
+      <w:tr>
+        <w:tc>
+          <w:tcPr>
+            <w:shd w:fill="E7F5F0" w:val="clear"/>
+          </w:tcPr>
+          <w:p>
+            <w:pPr>
+              <w:spacing w:after="50" w:line="270"/>
+            </w:pPr>
+            <w:r>
+              <w:rPr>
+                <w:rFonts w:ascii="Aptos" w:cs="Aptos" w:eastAsia="Aptos" w:hAnsi="Aptos"/>
+                <w:b/>
+                <w:bCs/>
+                <w:i w:val="false"/>
+                <w:iCs w:val="false"/>
+                <w:color w:val="0B766E"/>
+                <w:sz w:val="20"/>
+                <w:szCs w:val="20"/>
+              </w:rPr>
+              <w:t xml:space="preserve">Student URL caveat: </w:t>
+            </w:r>
+            <w:r>
+              <w:rPr>
+                <w:rFonts w:ascii="Aptos" w:cs="Aptos" w:eastAsia="Aptos" w:hAnsi="Aptos"/>
+                <w:b w:val="false"/>
+                <w:bCs w:val="false"/>
+                <w:i w:val="false"/>
+                <w:iCs w:val="false"/>
+                <w:color w:val="18242E"/>
+                <w:sz w:val="20"/>
+                <w:szCs w:val="20"/>
+              </w:rPr>
+              <w:t xml:space="preserve">The student blueprint itself declares url_prefix=/student and the factory also registers it with url_prefix=/student. That can produce effective URLs such as /student/student/dashboard. The intended public prefix is /student; production cleanup should keep the prefix in only one place. The student paths below describe the intended route contract.</w:t>
             </w:r>
           </w:p>
         </w:tc>

</xml_diff>